<commit_message>
updated obis metadata document with github links
</commit_message>
<xml_diff>
--- a/obis/obis_docs/OBIS Metadata Template - Motile Invertebrates.docx
+++ b/obis/obis_docs/OBIS Metadata Template - Motile Invertebrates.docx
@@ -347,10 +347,7 @@
     <w:p/>
     <w:p>
       <w:r>
-        <w:t xml:space="preserve">First Name: </w:t>
-      </w:r>
-      <w:r>
-        <w:t>Alyssa</w:t>
+        <w:t>First Name: Alyssa</w:t>
       </w:r>
     </w:p>
     <w:p>
@@ -420,13 +417,7 @@
           <w:rPr>
             <w:rStyle w:val="Hyperlink"/>
           </w:rPr>
-          <w:t>alyssa.gehman</w:t>
-        </w:r>
-        <w:r>
-          <w:rPr>
-            <w:rStyle w:val="Hyperlink"/>
-          </w:rPr>
-          <w:t>@hakai.org</w:t>
+          <w:t>alyssa.gehman@hakai.org</w:t>
         </w:r>
       </w:hyperlink>
     </w:p>
@@ -541,10 +532,7 @@
     </w:p>
     <w:p>
       <w:r>
-        <w:t xml:space="preserve">First Name: </w:t>
-      </w:r>
-      <w:r>
-        <w:t>Gillian</w:t>
+        <w:t>First Name: Gillian</w:t>
       </w:r>
     </w:p>
     <w:p>
@@ -602,35 +590,14 @@
           <w:rPr>
             <w:rStyle w:val="Hyperlink"/>
           </w:rPr>
-          <w:t>gillian</w:t>
-        </w:r>
-        <w:r>
-          <w:rPr>
-            <w:rStyle w:val="Hyperlink"/>
-          </w:rPr>
-          <w:t>.</w:t>
-        </w:r>
-        <w:r>
-          <w:rPr>
-            <w:rStyle w:val="Hyperlink"/>
-          </w:rPr>
-          <w:t>sadlierbrown</w:t>
-        </w:r>
-        <w:r>
-          <w:rPr>
-            <w:rStyle w:val="Hyperlink"/>
-          </w:rPr>
-          <w:t>@hakai.org</w:t>
+          <w:t>gillian.sadlierbrown@hakai.org</w:t>
         </w:r>
       </w:hyperlink>
     </w:p>
     <w:p/>
     <w:p>
       <w:r>
-        <w:t xml:space="preserve">First Name: </w:t>
-      </w:r>
-      <w:r>
-        <w:t>Margot</w:t>
+        <w:t>First Name: Margot</w:t>
       </w:r>
     </w:p>
     <w:p>
@@ -659,10 +626,7 @@
         <w:t xml:space="preserve">Position: </w:t>
       </w:r>
       <w:r>
-        <w:t xml:space="preserve">Research </w:t>
-      </w:r>
-      <w:r>
-        <w:t>Scientist</w:t>
+        <w:t>Research Scientist</w:t>
       </w:r>
     </w:p>
     <w:p>
@@ -1554,7 +1518,6 @@
           <w:iCs/>
           <w:lang w:val="en-CA"/>
         </w:rPr>
-        <w:lastRenderedPageBreak/>
         <w:t>here: </w:t>
       </w:r>
       <w:hyperlink r:id="rId12" w:history="1">
@@ -1565,191 +1528,202 @@
             <w:iCs/>
             <w:lang w:val="en-CA"/>
           </w:rPr>
-          <w:t>https://docs.google.com/document/d/11uqZNnwSabw0thcbntlTkZpVgVAkjPDJS17_ur6W7S8/edit</w:t>
+          <w:t>https:</w:t>
         </w:r>
-      </w:hyperlink>
-    </w:p>
-    <w:p>
-      <w:pPr>
-        <w:rPr>
-          <w:b/>
-          <w:bCs/>
-        </w:rPr>
-      </w:pPr>
-    </w:p>
-    <w:p>
-      <w:r>
-        <w:rPr>
-          <w:b/>
-          <w:bCs/>
-        </w:rPr>
-        <w:t>Name:</w:t>
-      </w:r>
-    </w:p>
-    <w:p>
-      <w:r>
-        <w:rPr>
-          <w:b/>
-          <w:bCs/>
-        </w:rPr>
-        <w:t>Role:</w:t>
-      </w:r>
-    </w:p>
-    <w:p>
-      <w:pPr>
-        <w:rPr>
-          <w:b/>
-          <w:bCs/>
-        </w:rPr>
-      </w:pPr>
-    </w:p>
-    <w:p>
-      <w:pPr>
-        <w:numPr>
-          <w:ilvl w:val="0"/>
-          <w:numId w:val="1"/>
-        </w:numPr>
-        <w:rPr>
-          <w:b/>
-          <w:bCs/>
-        </w:rPr>
-      </w:pPr>
-      <w:r>
-        <w:rPr>
-          <w:b/>
-          <w:bCs/>
-        </w:rPr>
-        <w:t>Sampling Methods</w:t>
-      </w:r>
-    </w:p>
-    <w:p>
-      <w:pPr>
-        <w:rPr>
-          <w:b/>
-          <w:bCs/>
-        </w:rPr>
-      </w:pPr>
-    </w:p>
-    <w:p>
-      <w:pPr>
-        <w:rPr>
-          <w:b/>
-          <w:bCs/>
-        </w:rPr>
-      </w:pPr>
-      <w:r>
-        <w:rPr>
-          <w:b/>
-          <w:bCs/>
-        </w:rPr>
-        <w:t>Study Extent</w:t>
-      </w:r>
-    </w:p>
-    <w:p>
-      <w:pPr>
-        <w:rPr>
-          <w:i/>
-          <w:iCs/>
-        </w:rPr>
-      </w:pPr>
-      <w:r>
-        <w:rPr>
-          <w:i/>
-          <w:iCs/>
-        </w:rPr>
-        <w:t>This dataset was collected from three rocky intertidal sites on the northwestern shore of Calvert Island in BC, Canada. These sites were sampled 4 or 5 times per year, starting in 2016, with most surveys being conducted in specific months. Survey months were February, May, June, August, and November. Occasionally surveys would be conducted in other months due to logistics. Surveys are ongoing as of Februa</w:t>
-      </w:r>
-      <w:r>
-        <w:rPr>
-          <w:i/>
-          <w:iCs/>
-        </w:rPr>
-        <w:t>ry 2026.</w:t>
-      </w:r>
-      <w:r>
-        <w:rPr>
-          <w:i/>
-          <w:iCs/>
-        </w:rPr>
-        <w:t xml:space="preserve">  </w:t>
-      </w:r>
-    </w:p>
-    <w:p>
-      <w:pPr>
-        <w:rPr>
-          <w:b/>
-          <w:bCs/>
-        </w:rPr>
-      </w:pPr>
-    </w:p>
-    <w:p>
-      <w:pPr>
-        <w:rPr>
-          <w:b/>
-          <w:bCs/>
-        </w:rPr>
-      </w:pPr>
-      <w:r>
-        <w:rPr>
-          <w:b/>
-          <w:bCs/>
-        </w:rPr>
-        <w:t>Sampling Description</w:t>
-      </w:r>
-    </w:p>
-    <w:p>
-      <w:pPr>
-        <w:rPr>
-          <w:i/>
-          <w:iCs/>
-        </w:rPr>
-      </w:pPr>
-      <w:r>
-        <w:rPr>
-          <w:i/>
-          <w:iCs/>
-        </w:rPr>
-        <w:t xml:space="preserve">Data was collected from permanent plot areas, marked by bolts, using quadrats. Quadrats were placed in 3 “habitat areas” typified by a dominant organism (barnacles, Mytilus californianus, and Fucus </w:t>
-      </w:r>
-      <w:proofErr w:type="spellStart"/>
-      <w:r>
-        <w:rPr>
-          <w:i/>
-          <w:iCs/>
-        </w:rPr>
-        <w:t>distichus</w:t>
-      </w:r>
-      <w:proofErr w:type="spellEnd"/>
-      <w:r>
-        <w:rPr>
-          <w:i/>
-          <w:iCs/>
-        </w:rPr>
-        <w:t>). At each time point five quadrats were surveyed in each habitat for a total of 15 quadrats. The diversity and abundance of motile invertebrate species were recorded in each plot. Within each plot area, the abundance of Littorina snails was also recorded from 3 smaller sub-quadrats. For a detailed description of sampling methods see the protocol</w:t>
-      </w:r>
-      <w:r>
-        <w:rPr>
-          <w:i/>
-          <w:iCs/>
-        </w:rPr>
-        <w:t xml:space="preserve"> (pg. 17): </w:t>
-      </w:r>
-    </w:p>
-    <w:p>
-      <w:pPr>
-        <w:rPr>
-          <w:i/>
-          <w:iCs/>
-        </w:rPr>
-      </w:pPr>
-      <w:hyperlink r:id="rId13" w:history="1">
         <w:r>
           <w:rPr>
             <w:rStyle w:val="Hyperlink"/>
             <w:i/>
             <w:iCs/>
+            <w:lang w:val="en-CA"/>
           </w:rPr>
-          <w:t>https://docs.google.com/document/d/1uBUyOL0s0O15yNWb2Ghh5N2LulDFOZvI-pmP1eno44Y/edit?tab=t.0#heading=h.4dzhu7l1jjzh</w:t>
+          <w:t>/</w:t>
+        </w:r>
+        <w:r>
+          <w:rPr>
+            <w:rStyle w:val="Hyperlink"/>
+            <w:i/>
+            <w:iCs/>
+            <w:lang w:val="en-CA"/>
+          </w:rPr>
+          <w:t>/github.com/HakaiInstitute/nearshore-RI_motileInvertebrates/blob/main/obis/obis_docs/nearshore_rocky_intertidal_overview%20.pdf</w:t>
+        </w:r>
+      </w:hyperlink>
+    </w:p>
+    <w:p>
+      <w:pPr>
+        <w:rPr>
+          <w:i/>
+          <w:iCs/>
+          <w:lang w:val="en-CA"/>
+        </w:rPr>
+      </w:pPr>
+    </w:p>
+    <w:p>
+      <w:r>
+        <w:rPr>
+          <w:b/>
+          <w:bCs/>
+        </w:rPr>
+        <w:t>Name:</w:t>
+      </w:r>
+    </w:p>
+    <w:p>
+      <w:r>
+        <w:rPr>
+          <w:b/>
+          <w:bCs/>
+        </w:rPr>
+        <w:t>Role:</w:t>
+      </w:r>
+    </w:p>
+    <w:p>
+      <w:pPr>
+        <w:rPr>
+          <w:b/>
+          <w:bCs/>
+        </w:rPr>
+      </w:pPr>
+    </w:p>
+    <w:p>
+      <w:pPr>
+        <w:numPr>
+          <w:ilvl w:val="0"/>
+          <w:numId w:val="1"/>
+        </w:numPr>
+        <w:rPr>
+          <w:b/>
+          <w:bCs/>
+        </w:rPr>
+      </w:pPr>
+      <w:r>
+        <w:rPr>
+          <w:b/>
+          <w:bCs/>
+        </w:rPr>
+        <w:t>Sampling Methods</w:t>
+      </w:r>
+    </w:p>
+    <w:p>
+      <w:pPr>
+        <w:rPr>
+          <w:b/>
+          <w:bCs/>
+        </w:rPr>
+      </w:pPr>
+    </w:p>
+    <w:p>
+      <w:pPr>
+        <w:rPr>
+          <w:b/>
+          <w:bCs/>
+        </w:rPr>
+      </w:pPr>
+      <w:r>
+        <w:rPr>
+          <w:b/>
+          <w:bCs/>
+        </w:rPr>
+        <w:t>Study Extent</w:t>
+      </w:r>
+    </w:p>
+    <w:p>
+      <w:pPr>
+        <w:rPr>
+          <w:i/>
+          <w:iCs/>
+        </w:rPr>
+      </w:pPr>
+      <w:r>
+        <w:rPr>
+          <w:i/>
+          <w:iCs/>
+        </w:rPr>
+        <w:t>This dataset was collected from three rocky intertidal sites on the northwestern shore of Calvert Island in BC, Canada. These sites were sampled 4 or 5 times per year, starting in 2016, with most surveys being conducted in specific months. Survey months were February, May, June, August, and November. Occasionally surveys would be conducted in other months due to logistics. Surveys are ongoing as of Februa</w:t>
+      </w:r>
+      <w:r>
+        <w:rPr>
+          <w:i/>
+          <w:iCs/>
+        </w:rPr>
+        <w:t>ry 2026.</w:t>
+      </w:r>
+      <w:r>
+        <w:rPr>
+          <w:i/>
+          <w:iCs/>
+        </w:rPr>
+        <w:t xml:space="preserve">  </w:t>
+      </w:r>
+    </w:p>
+    <w:p>
+      <w:pPr>
+        <w:rPr>
+          <w:b/>
+          <w:bCs/>
+        </w:rPr>
+      </w:pPr>
+    </w:p>
+    <w:p>
+      <w:pPr>
+        <w:rPr>
+          <w:b/>
+          <w:bCs/>
+        </w:rPr>
+      </w:pPr>
+      <w:r>
+        <w:rPr>
+          <w:b/>
+          <w:bCs/>
+        </w:rPr>
+        <w:t>Sampling Description</w:t>
+      </w:r>
+    </w:p>
+    <w:p>
+      <w:pPr>
+        <w:rPr>
+          <w:i/>
+          <w:iCs/>
+        </w:rPr>
+      </w:pPr>
+      <w:r>
+        <w:rPr>
+          <w:i/>
+          <w:iCs/>
+        </w:rPr>
+        <w:t xml:space="preserve">Data was collected from permanent plot areas, marked by bolts, using quadrats. Quadrats were placed in 3 “habitat areas” typified by a dominant organism (barnacles, Mytilus californianus, and Fucus </w:t>
+      </w:r>
+      <w:proofErr w:type="spellStart"/>
+      <w:r>
+        <w:rPr>
+          <w:i/>
+          <w:iCs/>
+        </w:rPr>
+        <w:t>distichus</w:t>
+      </w:r>
+      <w:proofErr w:type="spellEnd"/>
+      <w:r>
+        <w:rPr>
+          <w:i/>
+          <w:iCs/>
+        </w:rPr>
+        <w:t>). At each time point five quadrats were surveyed in each habitat for a total of 15 quadrats. The diversity and abundance of motile invertebrate species were recorded in each plot. Within each plot area, the abundance of Littorina snails was also recorded from 3 smaller sub-quadrats. For a detailed description of sampling methods see the protocol</w:t>
+      </w:r>
+      <w:r>
+        <w:rPr>
+          <w:i/>
+          <w:iCs/>
+        </w:rPr>
+        <w:t xml:space="preserve"> (pg. 17): </w:t>
+      </w:r>
+    </w:p>
+    <w:p>
+      <w:hyperlink r:id="rId13" w:history="1">
+        <w:r>
+          <w:rPr>
+            <w:rStyle w:val="Hyperlink"/>
+          </w:rPr>
+          <w:t>https://github.com/HakaiInstitute/nearshore-RI_motileInvertebrates/blob/main/protocols/rocky_intertidal-protocol.pdf</w:t>
         </w:r>
       </w:hyperlink>
     </w:p>
@@ -1925,7 +1899,7 @@
           <w:iCs/>
         </w:rPr>
       </w:pPr>
-      <w:hyperlink r:id="rId14" w:history="1">
+      <w:hyperlink r:id="rId14" w:anchor="heading=h.4dzhu7l1jjzh" w:history="1">
         <w:r>
           <w:rPr>
             <w:rStyle w:val="Hyperlink"/>
@@ -2784,6 +2758,7 @@
   <w:style w:type="character" w:default="1" w:styleId="DefaultParagraphFont">
     <w:name w:val="Default Paragraph Font"/>
     <w:uiPriority w:val="1"/>
+    <w:semiHidden/>
     <w:unhideWhenUsed/>
   </w:style>
   <w:style w:type="table" w:default="1" w:styleId="TableNormal">
@@ -2872,6 +2847,18 @@
     <w:rPr>
       <w:color w:val="605E5C"/>
       <w:shd w:val="clear" w:color="auto" w:fill="E1DFDD"/>
+    </w:rPr>
+  </w:style>
+  <w:style w:type="character" w:styleId="FollowedHyperlink">
+    <w:name w:val="FollowedHyperlink"/>
+    <w:basedOn w:val="DefaultParagraphFont"/>
+    <w:uiPriority w:val="99"/>
+    <w:semiHidden/>
+    <w:unhideWhenUsed/>
+    <w:rsid w:val="00CA55EE"/>
+    <w:rPr>
+      <w:color w:val="800080" w:themeColor="followedHyperlink"/>
+      <w:u w:val="single"/>
     </w:rPr>
   </w:style>
 </w:styles>

</xml_diff>